<commit_message>
backup dopo fase per psontoso
</commit_message>
<xml_diff>
--- a/DOCS_DA_CONVERTIRE/psontuoso_en.docx
+++ b/DOCS_DA_CONVERTIRE/psontuoso_en.docx
@@ -3,18 +3,18 @@
 <w:document xmlns:wpc="http://schemas.microsoft.com/office/word/2010/wordprocessingCanvas" xmlns:cx="http://schemas.microsoft.com/office/drawing/2014/chartex" xmlns:cx1="http://schemas.microsoft.com/office/drawing/2015/9/8/chartex" xmlns:cx2="http://schemas.microsoft.com/office/drawing/2015/10/21/chartex" xmlns:cx3="http://schemas.microsoft.com/office/drawing/2016/5/9/chartex" xmlns:cx4="http://schemas.microsoft.com/office/drawing/2016/5/10/chartex" xmlns:cx5="http://schemas.microsoft.com/office/drawing/2016/5/11/chartex" xmlns:cx6="http://schemas.microsoft.com/office/drawing/2016/5/12/chartex" xmlns:cx7="http://schemas.microsoft.com/office/drawing/2016/5/13/chartex" xmlns:cx8="http://schemas.microsoft.com/office/drawing/2016/5/14/chartex" xmlns:mc="http://schemas.openxmlformats.org/markup-compatibility/2006" xmlns:aink="http://schemas.microsoft.com/office/drawing/2016/ink" xmlns:am3d="http://schemas.microsoft.com/office/drawing/2017/model3d" xmlns:o="urn:schemas-microsoft-com:office:office" xmlns:oel="http://schemas.microsoft.com/office/2019/extlst" xmlns:r="http://schemas.openxmlformats.org/officeDocument/2006/relationships" xmlns:m="http://schemas.openxmlformats.org/officeDocument/2006/math" xmlns:v="urn:schemas-microsoft-com:vml" xmlns:wp14="http://schemas.microsoft.com/office/word/2010/wordprocessingDrawing" xmlns:wp="http://schemas.openxmlformats.org/drawingml/2006/wordprocessingDrawing" xmlns:w10="urn:schemas-microsoft-com:office:word" xmlns:w="http://schemas.openxmlformats.org/wordprocessingml/2006/main" xmlns:w14="http://schemas.microsoft.com/office/word/2010/wordml" xmlns:w15="http://schemas.microsoft.com/office/word/2012/wordml" xmlns:w16cex="http://schemas.microsoft.com/office/word/2018/wordml/cex" xmlns:w16cid="http://schemas.microsoft.com/office/word/2016/wordml/cid" xmlns:w16="http://schemas.microsoft.com/office/word/2018/wordml" xmlns:w16du="http://schemas.microsoft.com/office/word/2023/wordml/word16du" xmlns:w16sdtdh="http://schemas.microsoft.com/office/word/2020/wordml/sdtdatahash" xmlns:w16sdtfl="http://schemas.microsoft.com/office/word/2024/wordml/sdtformatlock" xmlns:w16se="http://schemas.microsoft.com/office/word/2015/wordml/symex" xmlns:wpg="http://schemas.microsoft.com/office/word/2010/wordprocessingGroup" xmlns:wpi="http://schemas.microsoft.com/office/word/2010/wordprocessingInk" xmlns:wne="http://schemas.microsoft.com/office/word/2006/wordml" xmlns:wps="http://schemas.microsoft.com/office/word/2010/wordprocessingShape" mc:Ignorable="w14 w15 w16se w16cid w16 w16cex w16sdtdh w16sdtfl w16du wp14">
   <w:body>
     <w:p>
-      <w:r xmlns:w="http://schemas.openxmlformats.org/wordprocessingml/2006/main">
+      <w:r>
         <w:t xml:space="preserve">The </w:t>
       </w:r>
-      <w:r xmlns:w="http://schemas.openxmlformats.org/wordprocessingml/2006/main">
+      <w:r>
         <w:rPr>
           <w:b/>
           <w:bCs/>
         </w:rPr>
         <w:t xml:space="preserve">Portone Sontuoso </w:t>
       </w:r>
-      <w:r xmlns:w="http://schemas.openxmlformats.org/wordprocessingml/2006/main">
-        <w:t xml:space="preserve">is much more than a simple entrance; it's the imposing "calling card" that marks the start of Bologna's most iconic climb. Located on Via Saragozza, it's the exact point where the portico separates from the city to begin its ascent toward Colle della Guardia.</w:t>
+      <w:r>
+        <w:t>is much more than a simple entrance; it's the imposing "calling card" that marks the start of Bologna's most iconic climb. Located on Via Saragozza, it's the exact point where the portico separates from the city to begin its ascent toward Colle della Guardia.</w:t>
       </w:r>
     </w:p>
     <w:p/>
@@ -67,180 +67,178 @@
       </w:r>
     </w:p>
     <w:p>
-      <w:pPr xmlns:w="http://schemas.openxmlformats.org/wordprocessingml/2006/main">
-        <w:rPr>
-          <w:noProof/>
-        </w:rPr>
-      </w:pPr>
-      <w:r xmlns:w="http://schemas.openxmlformats.org/wordprocessingml/2006/main">
-        <w:rPr>
-          <w:noProof/>
-        </w:rPr>
-        <w:t xml:space="preserve">[SPLIT_BLOCK:Portone_Sontuoso.jpg]</w:t>
-      </w:r>
-    </w:p>
-    <w:p>
-      <w:r xmlns:w="http://schemas.openxmlformats.org/wordprocessingml/2006/main">
-        <w:t xml:space="preserve">Here are the key details about this architectural masterpiece:</w:t>
-      </w:r>
-    </w:p>
-    <w:p>
-      <w:pPr xmlns:w="http://schemas.openxmlformats.org/wordprocessingml/2006/main">
+      <w:pPr>
+        <w:rPr>
+          <w:noProof/>
+        </w:rPr>
+      </w:pPr>
+      <w:r>
+        <w:rPr>
+          <w:noProof/>
+        </w:rPr>
+        <w:t>[SPLIT_BLOCK:Portone_Sontuoso.jpg]</w:t>
+      </w:r>
+    </w:p>
+    <w:p>
+      <w:r>
+        <w:t>Here are the key details about this architectural masterpiece:</w:t>
+      </w:r>
+    </w:p>
+    <w:p>
+      <w:pPr>
         <w:rPr>
           <w:b/>
           <w:bCs/>
         </w:rPr>
       </w:pPr>
-      <w:r xmlns:w="http://schemas.openxmlformats.org/wordprocessingml/2006/main">
+      <w:r>
         <w:rPr>
           <w:b/>
           <w:bCs/>
         </w:rPr>
-        <w:t xml:space="preserve">1. Architecture and Symbolism</w:t>
-      </w:r>
-    </w:p>
-    <w:p>
-      <w:r xmlns:w="http://schemas.openxmlformats.org/wordprocessingml/2006/main">
+        <w:t>1. Architecture and Symbolism</w:t>
+      </w:r>
+    </w:p>
+    <w:p>
+      <w:r>
         <w:t xml:space="preserve">Built in </w:t>
       </w:r>
-      <w:r xmlns:w="http://schemas.openxmlformats.org/wordprocessingml/2006/main">
+      <w:r>
         <w:rPr>
           <w:b/>
           <w:bCs/>
         </w:rPr>
         <w:t xml:space="preserve">1674 </w:t>
       </w:r>
-      <w:r xmlns:w="http://schemas.openxmlformats.org/wordprocessingml/2006/main">
+      <w:r>
         <w:t xml:space="preserve">, the arch was designed by architect </w:t>
       </w:r>
-      <w:r xmlns:w="http://schemas.openxmlformats.org/wordprocessingml/2006/main">
+      <w:r>
         <w:rPr>
           <w:b/>
           <w:bCs/>
         </w:rPr>
         <w:t xml:space="preserve">Gian Giacomo Monti </w:t>
       </w:r>
-      <w:r xmlns:w="http://schemas.openxmlformats.org/wordprocessingml/2006/main">
-        <w:t xml:space="preserve">.</w:t>
-      </w:r>
-    </w:p>
-    <w:p>
-      <w:pPr xmlns:w="http://schemas.openxmlformats.org/wordprocessingml/2006/main">
+      <w:r>
+        <w:t>.</w:t>
+      </w:r>
+    </w:p>
+    <w:p>
+      <w:pPr>
         <w:numPr>
           <w:ilvl w:val="0"/>
           <w:numId w:val="1"/>
         </w:numPr>
       </w:pPr>
-      <w:r xmlns:w="http://schemas.openxmlformats.org/wordprocessingml/2006/main">
+      <w:r>
         <w:rPr>
           <w:b/>
           <w:bCs/>
         </w:rPr>
         <w:t xml:space="preserve">Structure: </w:t>
       </w:r>
-      <w:r xmlns:w="http://schemas.openxmlformats.org/wordprocessingml/2006/main">
-        <w:t xml:space="preserve">It appears as a triumphal arch of the Corinthian order, monumental and decidedly taller and more ornate than the remaining 665 arches of the portico.</w:t>
-      </w:r>
-    </w:p>
-    <w:p>
-      <w:pPr xmlns:w="http://schemas.openxmlformats.org/wordprocessingml/2006/main">
+      <w:r>
+        <w:t>It appears as a triumphal arch of the Corinthian order, monumental and decidedly taller and more ornate than the remaining 665 arches of the portico.</w:t>
+      </w:r>
+    </w:p>
+    <w:p>
+      <w:pPr>
         <w:numPr>
           <w:ilvl w:val="0"/>
           <w:numId w:val="1"/>
         </w:numPr>
       </w:pPr>
-      <w:r xmlns:w="http://schemas.openxmlformats.org/wordprocessingml/2006/main">
+      <w:r>
         <w:rPr>
           <w:b/>
           <w:bCs/>
         </w:rPr>
         <w:t xml:space="preserve">Function: </w:t>
       </w:r>
-      <w:r xmlns:w="http://schemas.openxmlformats.org/wordprocessingml/2006/main">
-        <w:t xml:space="preserve">It marks the transition from the "profane" world of the city to the "sacred" world of the devotional journey. It marks the beginning of a nearly 4-kilometer-long path that symbolizes the body of the serpent (the devil) crushed at the feet of the Madonna (the Sanctuary).</w:t>
-      </w:r>
-    </w:p>
-    <w:p>
-      <w:pPr xmlns:w="http://schemas.openxmlformats.org/wordprocessingml/2006/main">
+      <w:r>
+        <w:t>It marks the transition from the "profane" world of the city to the "sacred" world of the devotional journey. It marks the beginning of a nearly 4-kilometer-long path that symbolizes the body of the serpent (the devil) crushed at the feet of the Madonna (the Sanctuary).</w:t>
+      </w:r>
+    </w:p>
+    <w:p>
+      <w:pPr>
         <w:rPr>
           <w:b/>
           <w:bCs/>
         </w:rPr>
       </w:pPr>
-      <w:r xmlns:w="http://schemas.openxmlformats.org/wordprocessingml/2006/main">
+      <w:r>
         <w:rPr>
           <w:b/>
           <w:bCs/>
         </w:rPr>
-        <w:t xml:space="preserve">2. Why is it called "Sumptuous"?</w:t>
-      </w:r>
-    </w:p>
-    <w:p>
-      <w:r xmlns:w="http://schemas.openxmlformats.org/wordprocessingml/2006/main">
-        <w:t xml:space="preserve">The name is not a modern exaggeration, but derives from its decorative richness compared to the sobriety of the rest of the route.</w:t>
-      </w:r>
-    </w:p>
-    <w:p>
-      <w:pPr xmlns:w="http://schemas.openxmlformats.org/wordprocessingml/2006/main">
+        <w:t>2. Why is it called "Sumptuous"?</w:t>
+      </w:r>
+    </w:p>
+    <w:p>
+      <w:r>
+        <w:t>The name is not a modern exaggeration, but derives from its decorative richness compared to the sobriety of the rest of the route.</w:t>
+      </w:r>
+    </w:p>
+    <w:p>
+      <w:pPr>
         <w:numPr>
           <w:ilvl w:val="0"/>
           <w:numId w:val="2"/>
         </w:numPr>
       </w:pPr>
-      <w:r xmlns:w="http://schemas.openxmlformats.org/wordprocessingml/2006/main">
+      <w:r>
         <w:t xml:space="preserve">It is adorned with the coat of arms of the </w:t>
       </w:r>
-      <w:r xmlns:w="http://schemas.openxmlformats.org/wordprocessingml/2006/main">
+      <w:r>
         <w:rPr>
           <w:b/>
           <w:bCs/>
         </w:rPr>
         <w:t xml:space="preserve">Bonaccorsi family </w:t>
       </w:r>
-      <w:r xmlns:w="http://schemas.openxmlformats.org/wordprocessingml/2006/main">
-        <w:t xml:space="preserve">, who financed its construction.</w:t>
-      </w:r>
-    </w:p>
-    <w:p>
-      <w:pPr xmlns:w="http://schemas.openxmlformats.org/wordprocessingml/2006/main">
+      <w:r>
+        <w:t>, who financed its construction.</w:t>
+      </w:r>
+    </w:p>
+    <w:p>
+      <w:pPr>
         <w:numPr>
           <w:ilvl w:val="0"/>
           <w:numId w:val="2"/>
         </w:numPr>
       </w:pPr>
-      <w:r xmlns:w="http://schemas.openxmlformats.org/wordprocessingml/2006/main">
-        <w:t xml:space="preserve">It features Latin inscriptions and relief decorations celebrating the protection of the Virgin over the city of Bologna.</w:t>
-      </w:r>
-    </w:p>
-    <w:p>
-      <w:pPr xmlns:w="http://schemas.openxmlformats.org/wordprocessingml/2006/main">
+      <w:r>
+        <w:t>It features Latin inscriptions and relief decorations celebrating the protection of the Virgin over the city of Bologna.</w:t>
+      </w:r>
+    </w:p>
+    <w:p>
+      <w:pPr>
         <w:rPr>
           <w:b/>
           <w:bCs/>
         </w:rPr>
       </w:pPr>
-      <w:r xmlns:w="http://schemas.openxmlformats.org/wordprocessingml/2006/main">
+      <w:r>
         <w:rPr>
           <w:b/>
           <w:bCs/>
         </w:rPr>
-        <w:t xml:space="preserve">3. A Historical Curiosity</w:t>
-      </w:r>
-    </w:p>
-    <w:p>
-      <w:r xmlns:w="http://schemas.openxmlformats.org/wordprocessingml/2006/main">
-        <w:lastRenderedPageBreak xmlns:w="http://schemas.openxmlformats.org/wordprocessingml/2006/main"/>
-      </w:r>
-      <w:r xmlns:w="http://schemas.openxmlformats.org/wordprocessingml/2006/main">
-        <w:t xml:space="preserve">Although today we see it perfectly integrated into the urban fabric, at the time of its construction, the Portone Sontuoso posed a real engineering and logistical challenge. It had to connect the flat stretch of road (built between 1674 and 1676) with the start of the steep climb leading to Meloncello.</w:t>
-      </w:r>
-    </w:p>
-    <w:p>
-      <w:r xmlns:w="http://schemas.openxmlformats.org/wordprocessingml/2006/main" xmlns:wp="http://schemas.openxmlformats.org/drawingml/2006/wordprocessingDrawing" xmlns:wp14="http://schemas.microsoft.com/office/word/2010/wordprocessingDrawing" xmlns:r="http://schemas.openxmlformats.org/officeDocument/2006/relationships">
-        <w:rPr>
-          <w:noProof/>
-        </w:rPr>
-        <w:drawing xmlns:w="http://schemas.openxmlformats.org/wordprocessingml/2006/main" xmlns:wp="http://schemas.openxmlformats.org/drawingml/2006/wordprocessingDrawing" xmlns:wp14="http://schemas.microsoft.com/office/word/2010/wordprocessingDrawing" xmlns:r="http://schemas.openxmlformats.org/officeDocument/2006/relationships">
+        <w:t>3. A Historical Curiosity</w:t>
+      </w:r>
+    </w:p>
+    <w:p>
+      <w:r>
+        <w:lastRenderedPageBreak/>
+        <w:t>Although today we see it perfectly integrated into the urban fabric, at the time of its construction, the Portone Sontuoso posed a real engineering and logistical challenge. It had to connect the flat stretch of road (built between 1674 and 1676) with the start of the steep climb leading to Meloncello.</w:t>
+      </w:r>
+    </w:p>
+    <w:p>
+      <w:r>
+        <w:rPr>
+          <w:noProof/>
+        </w:rPr>
+        <w:drawing>
           <wp:inline distT="0" distB="0" distL="0" distR="0" wp14:anchorId="227264A1" wp14:editId="59A5B6DD">
             <wp:extent cx="6120130" cy="4230370"/>
             <wp:effectExtent l="0" t="0" r="0" b="0"/>
@@ -282,229 +280,229 @@
           </wp:inline>
         </w:drawing>
       </w:r>
-      <w:r xmlns:w="http://schemas.openxmlformats.org/wordprocessingml/2006/main">
-        <w:rPr>
-          <w:noProof/>
-        </w:rPr>
-        <w:t xml:space="preserve">[SPLIT_BLOCK:Drawing_Bonaccorsi]</w:t>
-      </w:r>
-      <w:r xmlns:w="http://schemas.openxmlformats.org/wordprocessingml/2006/main">
+      <w:r>
         <w:t xml:space="preserve"> </w:t>
       </w:r>
-    </w:p>
-    <w:p>
-      <w:pPr xmlns:w="http://schemas.openxmlformats.org/wordprocessingml/2006/main">
-        <w:spacing w:after="0"/>
-      </w:pPr>
-      <w:r xmlns:w="http://schemas.openxmlformats.org/wordprocessingml/2006/main">
-        <w:t xml:space="preserve">The plaque under the porch reads:</w:t>
-      </w:r>
-    </w:p>
-    <w:p>
-      <w:pPr xmlns:w="http://schemas.openxmlformats.org/wordprocessingml/2006/main">
+      <w:r>
+        <w:rPr>
+          <w:noProof/>
+        </w:rPr>
+        <w:t>[SPLIT_BLOCK:Disegno_Bonaccorsi]</w:t>
+      </w:r>
+    </w:p>
+    <w:p>
+      <w:pPr>
+        <w:spacing w:after="0"/>
+      </w:pPr>
+      <w:r>
+        <w:t>The plaque under the porch reads:</w:t>
+      </w:r>
+    </w:p>
+    <w:p>
+      <w:pPr>
         <w:spacing w:after="0"/>
         <w:jc w:val="center"/>
         <w:rPr>
           <w:noProof/>
         </w:rPr>
       </w:pPr>
-      <w:r xmlns:w="http://schemas.openxmlformats.org/wordprocessingml/2006/main">
-        <w:rPr>
-          <w:noProof/>
-        </w:rPr>
-        <w:t xml:space="preserve">CLEMENTE X PONT OPT MAX</w:t>
-      </w:r>
-    </w:p>
-    <w:p>
-      <w:pPr xmlns:w="http://schemas.openxmlformats.org/wordprocessingml/2006/main">
+      <w:r>
+        <w:rPr>
+          <w:noProof/>
+        </w:rPr>
+        <w:t>CLEMENTE X PONT OPT MAX</w:t>
+      </w:r>
+    </w:p>
+    <w:p>
+      <w:pPr>
         <w:spacing w:after="0"/>
         <w:jc w:val="center"/>
         <w:rPr>
           <w:noProof/>
         </w:rPr>
       </w:pPr>
-      <w:r xmlns:w="http://schemas.openxmlformats.org/wordprocessingml/2006/main">
-        <w:rPr>
-          <w:noProof/>
-        </w:rPr>
-        <w:t xml:space="preserve">BONACCURSIUS</w:t>
-      </w:r>
-    </w:p>
-    <w:p>
-      <w:pPr xmlns:w="http://schemas.openxmlformats.org/wordprocessingml/2006/main">
+      <w:r>
+        <w:rPr>
+          <w:noProof/>
+        </w:rPr>
+        <w:t>BONACCURSIUS</w:t>
+      </w:r>
+    </w:p>
+    <w:p>
+      <w:pPr>
         <w:spacing w:after="0"/>
         <w:jc w:val="center"/>
         <w:rPr>
           <w:noProof/>
         </w:rPr>
       </w:pPr>
-      <w:r xmlns:w="http://schemas.openxmlformats.org/wordprocessingml/2006/main">
-        <w:rPr>
-          <w:noProof/>
-        </w:rPr>
-        <w:t xml:space="preserve">SRE CARDINALIS BONACCURSIUS</w:t>
-      </w:r>
-    </w:p>
-    <w:p>
-      <w:pPr xmlns:w="http://schemas.openxmlformats.org/wordprocessingml/2006/main">
+      <w:r>
+        <w:rPr>
+          <w:noProof/>
+        </w:rPr>
+        <w:t>S R E CARDINALIS BONACCURSIUS</w:t>
+      </w:r>
+    </w:p>
+    <w:p>
+      <w:pPr>
         <w:spacing w:after="0"/>
         <w:jc w:val="center"/>
         <w:rPr>
           <w:noProof/>
         </w:rPr>
       </w:pPr>
-      <w:r xmlns:w="http://schemas.openxmlformats.org/wordprocessingml/2006/main">
-        <w:rPr>
-          <w:noProof/>
-        </w:rPr>
-        <w:t xml:space="preserve">BONONIAE DE LATERE LEGATUS</w:t>
-      </w:r>
-    </w:p>
-    <w:p>
-      <w:pPr xmlns:w="http://schemas.openxmlformats.org/wordprocessingml/2006/main">
+      <w:r>
+        <w:rPr>
+          <w:noProof/>
+        </w:rPr>
+        <w:t>BONONIAE DE LATERE LEGATUS</w:t>
+      </w:r>
+    </w:p>
+    <w:p>
+      <w:pPr>
         <w:spacing w:after="0"/>
         <w:jc w:val="center"/>
         <w:rPr>
           <w:noProof/>
         </w:rPr>
       </w:pPr>
-      <w:r xmlns:w="http://schemas.openxmlformats.org/wordprocessingml/2006/main">
-        <w:rPr>
-          <w:noProof/>
-        </w:rPr>
-        <w:t xml:space="preserve">SINGULAR</w:t>
-      </w:r>
-    </w:p>
-    <w:p>
-      <w:pPr xmlns:w="http://schemas.openxmlformats.org/wordprocessingml/2006/main">
+      <w:r>
+        <w:rPr>
+          <w:noProof/>
+        </w:rPr>
+        <w:t>SINGULARI</w:t>
+      </w:r>
+    </w:p>
+    <w:p>
+      <w:pPr>
         <w:spacing w:after="0"/>
         <w:jc w:val="center"/>
         <w:rPr>
           <w:noProof/>
         </w:rPr>
       </w:pPr>
-      <w:r xmlns:w="http://schemas.openxmlformats.org/wordprocessingml/2006/main">
-        <w:rPr>
-          <w:noProof/>
-        </w:rPr>
-        <w:t xml:space="preserve">CIVIUM ERGA BEATAM VIRG. HAVE PITY</w:t>
-      </w:r>
-    </w:p>
-    <w:p>
-      <w:pPr xmlns:w="http://schemas.openxmlformats.org/wordprocessingml/2006/main">
+      <w:r>
+        <w:rPr>
+          <w:noProof/>
+        </w:rPr>
+        <w:t>CIVIUM ERGA BEATAM VIRG. PIETATI</w:t>
+      </w:r>
+    </w:p>
+    <w:p>
+      <w:pPr>
         <w:spacing w:after="0"/>
         <w:jc w:val="center"/>
         <w:rPr>
           <w:noProof/>
         </w:rPr>
       </w:pPr>
-      <w:r xmlns:w="http://schemas.openxmlformats.org/wordprocessingml/2006/main">
-        <w:rPr>
-          <w:noProof/>
-        </w:rPr>
-        <w:t xml:space="preserve">ELEGANT HOC FORNICE PRAEIVIT</w:t>
-      </w:r>
-    </w:p>
-    <w:p>
-      <w:pPr xmlns:w="http://schemas.openxmlformats.org/wordprocessingml/2006/main">
+      <w:r>
+        <w:rPr>
+          <w:noProof/>
+        </w:rPr>
+        <w:t>ELEGANTI HOC FORNICE PRAEIVIT</w:t>
+      </w:r>
+    </w:p>
+    <w:p>
+      <w:pPr>
         <w:spacing w:after="0"/>
         <w:jc w:val="center"/>
         <w:rPr>
           <w:noProof/>
         </w:rPr>
       </w:pPr>
-      <w:r xmlns:w="http://schemas.openxmlformats.org/wordprocessingml/2006/main">
-        <w:rPr>
-          <w:noProof/>
-        </w:rPr>
-        <w:t xml:space="preserve">YEAR IV MDCLXXV</w:t>
-      </w:r>
-    </w:p>
-    <w:p>
-      <w:pPr xmlns:w="http://schemas.openxmlformats.org/wordprocessingml/2006/main">
+      <w:r>
+        <w:rPr>
+          <w:noProof/>
+        </w:rPr>
+        <w:t>ANNO IVB MDCLXXV</w:t>
+      </w:r>
+    </w:p>
+    <w:p>
+      <w:pPr>
         <w:spacing w:after="0"/>
         <w:jc w:val="center"/>
         <w:rPr>
           <w:noProof/>
         </w:rPr>
       </w:pPr>
-      <w:r xmlns:w="http://schemas.openxmlformats.org/wordprocessingml/2006/main">
-        <w:rPr>
-          <w:noProof/>
-        </w:rPr>
-        <w:t xml:space="preserve">LEGATIONIS II</w:t>
-      </w:r>
-    </w:p>
-    <w:p>
-      <w:pPr xmlns:w="http://schemas.openxmlformats.org/wordprocessingml/2006/main">
+      <w:r>
+        <w:rPr>
+          <w:noProof/>
+        </w:rPr>
+        <w:t>LEGATIONIS II</w:t>
+      </w:r>
+    </w:p>
+    <w:p>
+      <w:pPr>
         <w:spacing w:after="0"/>
         <w:jc w:val="center"/>
         <w:rPr>
           <w:noProof/>
         </w:rPr>
       </w:pPr>
-      <w:r xmlns:w="http://schemas.openxmlformats.org/wordprocessingml/2006/main">
-        <w:rPr>
-          <w:noProof/>
-        </w:rPr>
-        <w:t xml:space="preserve">RAYMUNDUS COM. CAS. S. PETRI IN SABINIS</w:t>
-      </w:r>
-    </w:p>
-    <w:p>
-      <w:pPr xmlns:w="http://schemas.openxmlformats.org/wordprocessingml/2006/main">
+      <w:r>
+        <w:rPr>
+          <w:noProof/>
+        </w:rPr>
+        <w:t>RAYMUNDUS COM. CAS. S. PETRI IN SABINIS</w:t>
+      </w:r>
+    </w:p>
+    <w:p>
+      <w:pPr>
         <w:spacing w:after="0"/>
         <w:jc w:val="center"/>
         <w:rPr>
           <w:noProof/>
         </w:rPr>
       </w:pPr>
-      <w:r xmlns:w="http://schemas.openxmlformats.org/wordprocessingml/2006/main">
-        <w:rPr>
-          <w:noProof/>
-        </w:rPr>
-        <w:t xml:space="preserve">ET ALY FRATRES DE BONACURSIS</w:t>
-      </w:r>
-    </w:p>
-    <w:p>
-      <w:pPr xmlns:w="http://schemas.openxmlformats.org/wordprocessingml/2006/main">
+      <w:r>
+        <w:rPr>
+          <w:noProof/>
+        </w:rPr>
+        <w:t>ET ALY FRATRES DE BONACURSIS</w:t>
+      </w:r>
+    </w:p>
+    <w:p>
+      <w:pPr>
         <w:spacing w:after="0"/>
         <w:jc w:val="center"/>
         <w:rPr>
           <w:noProof/>
         </w:rPr>
       </w:pPr>
-      <w:r xmlns:w="http://schemas.openxmlformats.org/wordprocessingml/2006/main">
-        <w:rPr>
-          <w:noProof/>
-        </w:rPr>
-        <w:t xml:space="preserve">CARD. BONACURSIS EX FRAT. NEPOTES</w:t>
-      </w:r>
-    </w:p>
-    <w:p>
-      <w:pPr xmlns:w="http://schemas.openxmlformats.org/wordprocessingml/2006/main">
+      <w:r>
+        <w:rPr>
+          <w:noProof/>
+        </w:rPr>
+        <w:t>CARD. BONACURSIS EX FRAT. NEPOTES</w:t>
+      </w:r>
+    </w:p>
+    <w:p>
+      <w:pPr>
         <w:spacing w:after="0"/>
         <w:jc w:val="center"/>
         <w:rPr>
           <w:noProof/>
         </w:rPr>
       </w:pPr>
-      <w:r xmlns:w="http://schemas.openxmlformats.org/wordprocessingml/2006/main">
-        <w:rPr>
-          <w:noProof/>
-        </w:rPr>
-        <w:t xml:space="preserve">RESTAURARUNT</w:t>
-      </w:r>
-    </w:p>
-    <w:p>
-      <w:pPr xmlns:w="http://schemas.openxmlformats.org/wordprocessingml/2006/main">
+      <w:r>
+        <w:rPr>
+          <w:noProof/>
+        </w:rPr>
+        <w:t>RESTAURARUNT</w:t>
+      </w:r>
+    </w:p>
+    <w:p>
+      <w:pPr>
         <w:spacing w:after="0"/>
         <w:jc w:val="center"/>
       </w:pPr>
-      <w:r xmlns:w="http://schemas.openxmlformats.org/wordprocessingml/2006/main">
-        <w:rPr>
-          <w:noProof/>
-        </w:rPr>
-        <w:t xml:space="preserve">Psalm Year 1726</w:t>
+      <w:r>
+        <w:rPr>
+          <w:noProof/>
+        </w:rPr>
+        <w:t>ANNO SAL. MDCCXVI</w:t>
       </w:r>
     </w:p>
     <w:p>
@@ -520,45 +518,45 @@
       </w:pPr>
     </w:p>
     <w:p>
-      <w:pPr xmlns:w="http://schemas.openxmlformats.org/wordprocessingml/2006/main">
-        <w:spacing w:after="0"/>
-      </w:pPr>
-      <w:r xmlns:w="http://schemas.openxmlformats.org/wordprocessingml/2006/main">
-        <w:t xml:space="preserve">“Being Clement X, Pontiff Optimus Maximus, Bonaccorso Bonaccorsi, Cardinal of the Holy Roman Church, Legate of Bologna, preceded with this elegant bow the piety of the Bolognese towards the Blessed Virgin, in the jubilee year 1675, the second of his legation.</w:t>
-      </w:r>
-    </w:p>
-    <w:p>
-      <w:pPr xmlns:w="http://schemas.openxmlformats.org/wordprocessingml/2006/main">
-        <w:spacing w:after="0"/>
-      </w:pPr>
-      <w:r xmlns:w="http://schemas.openxmlformats.org/wordprocessingml/2006/main">
-        <w:t xml:space="preserve">Count Raimondo of Castel S. Pietro in Sabina and the other Bonaccorsi brothers, nephews of Cardinal Bonaccorso on his brother's side, restored it in the year of salvation 1716.”</w:t>
-      </w:r>
-    </w:p>
-    <w:p>
-      <w:pPr>
-        <w:spacing w:after="0"/>
-      </w:pPr>
-    </w:p>
-    <w:p>
-      <w:pPr xmlns:w="http://schemas.openxmlformats.org/wordprocessingml/2006/main">
-        <w:spacing w:after="0"/>
-      </w:pPr>
-      <w:r xmlns:w="http://schemas.openxmlformats.org/wordprocessingml/2006/main">
-        <w:t xml:space="preserve">It corresponds to the major arch no. 1 (the number in this print is implied, but obvious) of the Division of the sumptuous portico.</w:t>
-      </w:r>
-    </w:p>
-    <w:p>
-      <w:pPr>
-        <w:spacing w:after="0"/>
-      </w:pPr>
-    </w:p>
-    <w:p>
-      <w:pPr xmlns:w="http://schemas.openxmlformats.org/wordprocessingml/2006/main">
-        <w:spacing w:after="0"/>
-      </w:pPr>
-      <w:r xmlns:w="http://schemas.openxmlformats.org/wordprocessingml/2006/main">
-        <w:t xml:space="preserve">Very Famous Portico 1707 – Arch 1. Financed by Cardinal Bonaccorsi, Legate of Bologna.</w:t>
+      <w:pPr>
+        <w:spacing w:after="0"/>
+      </w:pPr>
+      <w:r>
+        <w:t>“Being Clement X, Pontiff Optimus Maximus, Bonaccorso Bonaccorsi, Cardinal of the Holy Roman Church, Legate of Bologna, preceded with this elegant bow the piety of the Bolognese towards the Blessed Virgin, in the jubilee year 1675, the second of his legation.</w:t>
+      </w:r>
+    </w:p>
+    <w:p>
+      <w:pPr>
+        <w:spacing w:after="0"/>
+      </w:pPr>
+      <w:r>
+        <w:t>Count Raimondo of Castel S. Pietro in Sabina and the other Bonaccorsi brothers, nephews of Cardinal Bonaccorso on his brother's side, restored it in the year of salvation 1716.”</w:t>
+      </w:r>
+    </w:p>
+    <w:p>
+      <w:pPr>
+        <w:spacing w:after="0"/>
+      </w:pPr>
+    </w:p>
+    <w:p>
+      <w:pPr>
+        <w:spacing w:after="0"/>
+      </w:pPr>
+      <w:r>
+        <w:t>It corresponds to the major arch no. 1 (the number in this print is implied, but obvious) of the Division of the sumptuous portico.</w:t>
+      </w:r>
+    </w:p>
+    <w:p>
+      <w:pPr>
+        <w:spacing w:after="0"/>
+      </w:pPr>
+    </w:p>
+    <w:p>
+      <w:pPr>
+        <w:spacing w:after="0"/>
+      </w:pPr>
+      <w:r>
+        <w:t>Very Famous Portico 1707 – Arch 1. Financed by Cardinal Bonaccorsi, Legate of Bologna.</w:t>
       </w:r>
     </w:p>
     <w:sectPr>
@@ -1483,6 +1481,7 @@
   <w:style w:type="character" w:default="1" w:styleId="Carpredefinitoparagrafo">
     <w:name w:val="Default Paragraph Font"/>
     <w:uiPriority w:val="1"/>
+    <w:semiHidden/>
     <w:unhideWhenUsed/>
   </w:style>
   <w:style w:type="table" w:default="1" w:styleId="Tabellanormale">

</xml_diff>